<commit_message>
Förderbericht Iserlohn im BVKT-Design (Farben und Logo aus der Evaluationstabelle)
Co-Authored-By: Claude Opus 5.5 <noreply@anthropic.com>
Claude-Session: https://claude.ai/code/session_01Azv4xVHS22bDY7j2oUgLPs
</commit_message>
<xml_diff>
--- a/berichte/kids_for_success_iserlohn/Foerderbericht_Kids_for_Success_Iserlohn_Eingangsevaluation_2026.docx
+++ b/berichte/kids_for_success_iserlohn/Foerderbericht_Kids_for_Success_Iserlohn_Eingangsevaluation_2026.docx
@@ -4,100 +4,361 @@
   <w:body>
     <w:p>
       <w:pPr>
-        <w:spacing w:after="240"/>
-      </w:pPr>
-      <w:r>
-        <w:rPr>
-          <w:b/>
-          <w:bCs/>
-          <w:color w:val="1F4E79"/>
-          <w:sz w:val="36"/>
-          <w:szCs w:val="36"/>
+        <w:spacing w:after="60" w:before="120"/>
+      </w:pPr>
+      <w:r>
+        <w:rPr>
+          <w:b/>
+          <w:bCs/>
+          <w:color w:val="FBAF3F"/>
+          <w:spacing w:val="40"/>
+          <w:sz w:val="20"/>
+          <w:szCs w:val="20"/>
+        </w:rPr>
+        <w:t xml:space="preserve">KIDS FOR SUCCESS</w:t>
+      </w:r>
+    </w:p>
+    <w:p>
+      <w:pPr>
+        <w:spacing w:after="280"/>
+      </w:pPr>
+      <w:r>
+        <w:rPr>
+          <w:b/>
+          <w:bCs/>
+          <w:color w:val="005E8F"/>
+          <w:sz w:val="40"/>
+          <w:szCs w:val="40"/>
         </w:rPr>
         <w:t xml:space="preserve">Förderbericht zur Eingangsevaluation</w:t>
       </w:r>
     </w:p>
-    <w:p>
-      <w:pPr>
-        <w:spacing w:after="40"/>
-      </w:pPr>
-      <w:r>
-        <w:rPr>
-          <w:b/>
-          <w:bCs/>
-        </w:rPr>
-        <w:t xml:space="preserve">Projekt: </w:t>
-      </w:r>
-      <w:r>
-        <w:t xml:space="preserve">Kids for success</w:t>
-      </w:r>
-    </w:p>
-    <w:p>
-      <w:pPr>
-        <w:spacing w:after="40"/>
-      </w:pPr>
-      <w:r>
-        <w:rPr>
-          <w:b/>
-          <w:bCs/>
-        </w:rPr>
-        <w:t xml:space="preserve">Institution: </w:t>
-      </w:r>
-      <w:r>
-        <w:t xml:space="preserve">Bartholomäusschule Iserlohn</w:t>
-      </w:r>
-    </w:p>
-    <w:p>
-      <w:pPr>
-        <w:spacing w:after="40"/>
-      </w:pPr>
-      <w:r>
-        <w:rPr>
-          <w:b/>
-          <w:bCs/>
-        </w:rPr>
-        <w:t xml:space="preserve">Zeitpunkt: </w:t>
-      </w:r>
-      <w:r>
-        <w:t xml:space="preserve">25. September 2026 (Schuljahr 2026/27)</w:t>
-      </w:r>
-    </w:p>
-    <w:p>
-      <w:pPr>
-        <w:spacing w:after="40"/>
-      </w:pPr>
-      <w:r>
-        <w:rPr>
-          <w:b/>
-          <w:bCs/>
-        </w:rPr>
-        <w:t xml:space="preserve">Anzahl teilnehmender Kinder: </w:t>
-      </w:r>
-      <w:r>
-        <w:t xml:space="preserve">10 (Alter: 7 bis 9 Jahre)</w:t>
-      </w:r>
-    </w:p>
-    <w:p>
-      <w:pPr>
-        <w:spacing w:after="40"/>
-      </w:pPr>
-      <w:r>
-        <w:rPr>
-          <w:b/>
-          <w:bCs/>
-        </w:rPr>
-        <w:t xml:space="preserve">Bereich: </w:t>
-      </w:r>
-      <w:r>
-        <w:t xml:space="preserve">Visuell-kognitives Training und motorische Entwicklung</w:t>
-      </w:r>
+    <w:tbl>
+      <w:tblPr>
+        <w:tblW w:type="dxa" w:w="9026"/>
+        <w:tblBorders>
+          <w:top w:val="single" w:color="005E8F" w:sz="12"/>
+          <w:left w:val="none" w:color="FFFFFF" w:sz="0"/>
+          <w:bottom w:val="single" w:color="005E8F" w:sz="12"/>
+          <w:right w:val="none" w:color="FFFFFF" w:sz="0"/>
+          <w:insideH w:val="single" w:color="DCEAF3" w:sz="2"/>
+          <w:insideV w:val="none" w:color="FFFFFF" w:sz="0"/>
+        </w:tblBorders>
+      </w:tblPr>
+      <w:tblGrid>
+        <w:gridCol w:w="3200"/>
+        <w:gridCol w:w="5826"/>
+      </w:tblGrid>
+      <w:tr>
+        <w:tc>
+          <w:tcPr>
+            <w:tcW w:type="dxa" w:w="3200"/>
+            <w:tcBorders>
+              <w:top w:val="none" w:color="FFFFFF" w:sz="0"/>
+              <w:left w:val="none" w:color="FFFFFF" w:sz="0"/>
+              <w:bottom w:val="none" w:color="FFFFFF" w:sz="0"/>
+              <w:right w:val="none" w:color="FFFFFF" w:sz="0"/>
+            </w:tcBorders>
+            <w:shd w:fill="F3F8FB" w:color="auto" w:val="clear"/>
+            <w:tcMar>
+              <w:top w:type="dxa" w:w="50"/>
+              <w:left w:type="dxa" w:w="160"/>
+              <w:bottom w:type="dxa" w:w="50"/>
+              <w:right w:type="dxa" w:w="100"/>
+            </w:tcMar>
+          </w:tcPr>
+          <w:p>
+            <w:r>
+              <w:rPr>
+                <w:b/>
+                <w:bCs/>
+                <w:color w:val="005E8F"/>
+                <w:sz w:val="20"/>
+                <w:szCs w:val="20"/>
+              </w:rPr>
+              <w:t xml:space="preserve">Projekt</w:t>
+            </w:r>
+          </w:p>
+        </w:tc>
+        <w:tc>
+          <w:tcPr>
+            <w:tcW w:type="dxa" w:w="5826"/>
+            <w:tcBorders>
+              <w:top w:val="none" w:color="FFFFFF" w:sz="0"/>
+              <w:left w:val="none" w:color="FFFFFF" w:sz="0"/>
+              <w:bottom w:val="none" w:color="FFFFFF" w:sz="0"/>
+              <w:right w:val="none" w:color="FFFFFF" w:sz="0"/>
+            </w:tcBorders>
+            <w:shd w:fill="F3F8FB" w:color="auto" w:val="clear"/>
+            <w:tcMar>
+              <w:top w:type="dxa" w:w="50"/>
+              <w:left w:type="dxa" w:w="100"/>
+              <w:bottom w:type="dxa" w:w="50"/>
+              <w:right w:type="dxa" w:w="100"/>
+            </w:tcMar>
+          </w:tcPr>
+          <w:p>
+            <w:r>
+              <w:rPr>
+                <w:sz w:val="20"/>
+                <w:szCs w:val="20"/>
+              </w:rPr>
+              <w:t xml:space="preserve">Kids for success</w:t>
+            </w:r>
+          </w:p>
+        </w:tc>
+      </w:tr>
+      <w:tr>
+        <w:tc>
+          <w:tcPr>
+            <w:tcW w:type="dxa" w:w="3200"/>
+            <w:tcBorders>
+              <w:top w:val="none" w:color="FFFFFF" w:sz="0"/>
+              <w:left w:val="none" w:color="FFFFFF" w:sz="0"/>
+              <w:bottom w:val="none" w:color="FFFFFF" w:sz="0"/>
+              <w:right w:val="none" w:color="FFFFFF" w:sz="0"/>
+            </w:tcBorders>
+            <w:shd w:fill="F3F8FB" w:color="auto" w:val="clear"/>
+            <w:tcMar>
+              <w:top w:type="dxa" w:w="50"/>
+              <w:left w:type="dxa" w:w="160"/>
+              <w:bottom w:type="dxa" w:w="50"/>
+              <w:right w:type="dxa" w:w="100"/>
+            </w:tcMar>
+          </w:tcPr>
+          <w:p>
+            <w:r>
+              <w:rPr>
+                <w:b/>
+                <w:bCs/>
+                <w:color w:val="005E8F"/>
+                <w:sz w:val="20"/>
+                <w:szCs w:val="20"/>
+              </w:rPr>
+              <w:t xml:space="preserve">Institution</w:t>
+            </w:r>
+          </w:p>
+        </w:tc>
+        <w:tc>
+          <w:tcPr>
+            <w:tcW w:type="dxa" w:w="5826"/>
+            <w:tcBorders>
+              <w:top w:val="none" w:color="FFFFFF" w:sz="0"/>
+              <w:left w:val="none" w:color="FFFFFF" w:sz="0"/>
+              <w:bottom w:val="none" w:color="FFFFFF" w:sz="0"/>
+              <w:right w:val="none" w:color="FFFFFF" w:sz="0"/>
+            </w:tcBorders>
+            <w:shd w:fill="F3F8FB" w:color="auto" w:val="clear"/>
+            <w:tcMar>
+              <w:top w:type="dxa" w:w="50"/>
+              <w:left w:type="dxa" w:w="100"/>
+              <w:bottom w:type="dxa" w:w="50"/>
+              <w:right w:type="dxa" w:w="100"/>
+            </w:tcMar>
+          </w:tcPr>
+          <w:p>
+            <w:r>
+              <w:rPr>
+                <w:sz w:val="20"/>
+                <w:szCs w:val="20"/>
+              </w:rPr>
+              <w:t xml:space="preserve">Bartholomäusschule Iserlohn</w:t>
+            </w:r>
+          </w:p>
+        </w:tc>
+      </w:tr>
+      <w:tr>
+        <w:tc>
+          <w:tcPr>
+            <w:tcW w:type="dxa" w:w="3200"/>
+            <w:tcBorders>
+              <w:top w:val="none" w:color="FFFFFF" w:sz="0"/>
+              <w:left w:val="none" w:color="FFFFFF" w:sz="0"/>
+              <w:bottom w:val="none" w:color="FFFFFF" w:sz="0"/>
+              <w:right w:val="none" w:color="FFFFFF" w:sz="0"/>
+            </w:tcBorders>
+            <w:shd w:fill="F3F8FB" w:color="auto" w:val="clear"/>
+            <w:tcMar>
+              <w:top w:type="dxa" w:w="50"/>
+              <w:left w:type="dxa" w:w="160"/>
+              <w:bottom w:type="dxa" w:w="50"/>
+              <w:right w:type="dxa" w:w="100"/>
+            </w:tcMar>
+          </w:tcPr>
+          <w:p>
+            <w:r>
+              <w:rPr>
+                <w:b/>
+                <w:bCs/>
+                <w:color w:val="005E8F"/>
+                <w:sz w:val="20"/>
+                <w:szCs w:val="20"/>
+              </w:rPr>
+              <w:t xml:space="preserve">Zeitpunkt</w:t>
+            </w:r>
+          </w:p>
+        </w:tc>
+        <w:tc>
+          <w:tcPr>
+            <w:tcW w:type="dxa" w:w="5826"/>
+            <w:tcBorders>
+              <w:top w:val="none" w:color="FFFFFF" w:sz="0"/>
+              <w:left w:val="none" w:color="FFFFFF" w:sz="0"/>
+              <w:bottom w:val="none" w:color="FFFFFF" w:sz="0"/>
+              <w:right w:val="none" w:color="FFFFFF" w:sz="0"/>
+            </w:tcBorders>
+            <w:shd w:fill="F3F8FB" w:color="auto" w:val="clear"/>
+            <w:tcMar>
+              <w:top w:type="dxa" w:w="50"/>
+              <w:left w:type="dxa" w:w="100"/>
+              <w:bottom w:type="dxa" w:w="50"/>
+              <w:right w:type="dxa" w:w="100"/>
+            </w:tcMar>
+          </w:tcPr>
+          <w:p>
+            <w:r>
+              <w:rPr>
+                <w:sz w:val="20"/>
+                <w:szCs w:val="20"/>
+              </w:rPr>
+              <w:t xml:space="preserve">25. September 2026 (Schuljahr 2026/27)</w:t>
+            </w:r>
+          </w:p>
+        </w:tc>
+      </w:tr>
+      <w:tr>
+        <w:tc>
+          <w:tcPr>
+            <w:tcW w:type="dxa" w:w="3200"/>
+            <w:tcBorders>
+              <w:top w:val="none" w:color="FFFFFF" w:sz="0"/>
+              <w:left w:val="none" w:color="FFFFFF" w:sz="0"/>
+              <w:bottom w:val="none" w:color="FFFFFF" w:sz="0"/>
+              <w:right w:val="none" w:color="FFFFFF" w:sz="0"/>
+            </w:tcBorders>
+            <w:shd w:fill="F3F8FB" w:color="auto" w:val="clear"/>
+            <w:tcMar>
+              <w:top w:type="dxa" w:w="50"/>
+              <w:left w:type="dxa" w:w="160"/>
+              <w:bottom w:type="dxa" w:w="50"/>
+              <w:right w:type="dxa" w:w="100"/>
+            </w:tcMar>
+          </w:tcPr>
+          <w:p>
+            <w:r>
+              <w:rPr>
+                <w:b/>
+                <w:bCs/>
+                <w:color w:val="005E8F"/>
+                <w:sz w:val="20"/>
+                <w:szCs w:val="20"/>
+              </w:rPr>
+              <w:t xml:space="preserve">Anzahl teilnehmender Kinder</w:t>
+            </w:r>
+          </w:p>
+        </w:tc>
+        <w:tc>
+          <w:tcPr>
+            <w:tcW w:type="dxa" w:w="5826"/>
+            <w:tcBorders>
+              <w:top w:val="none" w:color="FFFFFF" w:sz="0"/>
+              <w:left w:val="none" w:color="FFFFFF" w:sz="0"/>
+              <w:bottom w:val="none" w:color="FFFFFF" w:sz="0"/>
+              <w:right w:val="none" w:color="FFFFFF" w:sz="0"/>
+            </w:tcBorders>
+            <w:shd w:fill="F3F8FB" w:color="auto" w:val="clear"/>
+            <w:tcMar>
+              <w:top w:type="dxa" w:w="50"/>
+              <w:left w:type="dxa" w:w="100"/>
+              <w:bottom w:type="dxa" w:w="50"/>
+              <w:right w:type="dxa" w:w="100"/>
+            </w:tcMar>
+          </w:tcPr>
+          <w:p>
+            <w:r>
+              <w:rPr>
+                <w:sz w:val="20"/>
+                <w:szCs w:val="20"/>
+              </w:rPr>
+              <w:t xml:space="preserve">10 (Alter: 7 bis 9 Jahre)</w:t>
+            </w:r>
+          </w:p>
+        </w:tc>
+      </w:tr>
+      <w:tr>
+        <w:tc>
+          <w:tcPr>
+            <w:tcW w:type="dxa" w:w="3200"/>
+            <w:tcBorders>
+              <w:top w:val="none" w:color="FFFFFF" w:sz="0"/>
+              <w:left w:val="none" w:color="FFFFFF" w:sz="0"/>
+              <w:bottom w:val="none" w:color="FFFFFF" w:sz="0"/>
+              <w:right w:val="none" w:color="FFFFFF" w:sz="0"/>
+            </w:tcBorders>
+            <w:shd w:fill="F3F8FB" w:color="auto" w:val="clear"/>
+            <w:tcMar>
+              <w:top w:type="dxa" w:w="50"/>
+              <w:left w:type="dxa" w:w="160"/>
+              <w:bottom w:type="dxa" w:w="50"/>
+              <w:right w:type="dxa" w:w="100"/>
+            </w:tcMar>
+          </w:tcPr>
+          <w:p>
+            <w:r>
+              <w:rPr>
+                <w:b/>
+                <w:bCs/>
+                <w:color w:val="005E8F"/>
+                <w:sz w:val="20"/>
+                <w:szCs w:val="20"/>
+              </w:rPr>
+              <w:t xml:space="preserve">Bereich</w:t>
+            </w:r>
+          </w:p>
+        </w:tc>
+        <w:tc>
+          <w:tcPr>
+            <w:tcW w:type="dxa" w:w="5826"/>
+            <w:tcBorders>
+              <w:top w:val="none" w:color="FFFFFF" w:sz="0"/>
+              <w:left w:val="none" w:color="FFFFFF" w:sz="0"/>
+              <w:bottom w:val="none" w:color="FFFFFF" w:sz="0"/>
+              <w:right w:val="none" w:color="FFFFFF" w:sz="0"/>
+            </w:tcBorders>
+            <w:shd w:fill="F3F8FB" w:color="auto" w:val="clear"/>
+            <w:tcMar>
+              <w:top w:type="dxa" w:w="50"/>
+              <w:left w:type="dxa" w:w="100"/>
+              <w:bottom w:type="dxa" w:w="50"/>
+              <w:right w:type="dxa" w:w="100"/>
+            </w:tcMar>
+          </w:tcPr>
+          <w:p>
+            <w:r>
+              <w:rPr>
+                <w:sz w:val="20"/>
+                <w:szCs w:val="20"/>
+              </w:rPr>
+              <w:t xml:space="preserve">Visuell-kognitives Training und motorische Entwicklung</w:t>
+            </w:r>
+          </w:p>
+        </w:tc>
+      </w:tr>
+    </w:tbl>
+    <w:p>
+      <w:pPr>
+        <w:spacing w:after="120"/>
+      </w:pPr>
     </w:p>
     <w:p>
       <w:pPr>
         <w:pStyle w:val="Heading1"/>
         <w:keepNext/>
         <w:keepLines/>
-        <w:spacing w:after="140" w:before="320"/>
+        <w:pBdr>
+          <w:bottom w:val="single" w:color="B8C7D1" w:sz="6" w:space="4"/>
+        </w:pBdr>
+        <w:spacing w:after="160" w:before="360"/>
       </w:pPr>
       <w:r>
         <w:t xml:space="preserve">1. Auftragsklärung und Ziel der Evaluation</w:t>
@@ -116,7 +377,10 @@
         <w:pStyle w:val="Heading1"/>
         <w:keepNext/>
         <w:keepLines/>
-        <w:spacing w:after="140" w:before="320"/>
+        <w:pBdr>
+          <w:bottom w:val="single" w:color="B8C7D1" w:sz="6" w:space="4"/>
+        </w:pBdr>
+        <w:spacing w:after="160" w:before="360"/>
       </w:pPr>
       <w:r>
         <w:t xml:space="preserve">2. Durchgeführte Testverfahren</w:t>
@@ -143,6 +407,7 @@
         <w:rPr>
           <w:b/>
           <w:bCs/>
+          <w:color w:val="005E8F"/>
         </w:rPr>
         <w:t xml:space="preserve">Farbtafel / Tapping</w:t>
       </w:r>
@@ -163,6 +428,7 @@
         <w:rPr>
           <w:b/>
           <w:bCs/>
+          <w:color w:val="005E8F"/>
         </w:rPr>
         <w:t xml:space="preserve">Fitlight</w:t>
       </w:r>
@@ -183,6 +449,7 @@
         <w:rPr>
           <w:b/>
           <w:bCs/>
+          <w:color w:val="005E8F"/>
         </w:rPr>
         <w:t xml:space="preserve">Koordinationsleiter</w:t>
       </w:r>
@@ -203,6 +470,7 @@
         <w:rPr>
           <w:b/>
           <w:bCs/>
+          <w:color w:val="005E8F"/>
         </w:rPr>
         <w:t xml:space="preserve">Seilspringen</w:t>
       </w:r>
@@ -223,6 +491,7 @@
         <w:rPr>
           <w:b/>
           <w:bCs/>
+          <w:color w:val="005E8F"/>
         </w:rPr>
         <w:t xml:space="preserve">Frisbee</w:t>
       </w:r>
@@ -243,6 +512,7 @@
         <w:rPr>
           <w:b/>
           <w:bCs/>
+          <w:color w:val="005E8F"/>
         </w:rPr>
         <w:t xml:space="preserve">BVA</w:t>
       </w:r>
@@ -263,6 +533,7 @@
         <w:rPr>
           <w:b/>
           <w:bCs/>
+          <w:color w:val="005E8F"/>
         </w:rPr>
         <w:t xml:space="preserve">EyeTracker</w:t>
       </w:r>
@@ -343,7 +614,10 @@
         <w:pStyle w:val="Heading1"/>
         <w:keepNext/>
         <w:keepLines/>
-        <w:spacing w:after="140" w:before="320"/>
+        <w:pBdr>
+          <w:bottom w:val="single" w:color="B8C7D1" w:sz="6" w:space="4"/>
+        </w:pBdr>
+        <w:spacing w:after="160" w:before="360"/>
       </w:pPr>
       <w:r>
         <w:t xml:space="preserve">3. Allgemeine Beobachtungen während der Testdurchführung</w:t>
@@ -457,6 +731,7 @@
         <w:rPr>
           <w:b/>
           <w:bCs/>
+          <w:color w:val="005E8F"/>
         </w:rPr>
         <w:t xml:space="preserve">fünf Kindern</w:t>
       </w:r>
@@ -480,6 +755,7 @@
         <w:rPr>
           <w:b/>
           <w:bCs/>
+          <w:color w:val="005E8F"/>
         </w:rPr>
         <w:t xml:space="preserve">zwei Kindern</w:t>
       </w:r>
@@ -503,6 +779,7 @@
         <w:rPr>
           <w:b/>
           <w:bCs/>
+          <w:color w:val="005E8F"/>
         </w:rPr>
         <w:t xml:space="preserve">fünf Kindern</w:t>
       </w:r>
@@ -541,7 +818,10 @@
         <w:pStyle w:val="Heading1"/>
         <w:keepNext/>
         <w:keepLines/>
-        <w:spacing w:after="140" w:before="320"/>
+        <w:pBdr>
+          <w:bottom w:val="single" w:color="B8C7D1" w:sz="6" w:space="4"/>
+        </w:pBdr>
+        <w:spacing w:after="160" w:before="360"/>
       </w:pPr>
       <w:r>
         <w:t xml:space="preserve">4. Ergebnisse der Testverfahren</w:t>
@@ -585,6 +865,7 @@
         <w:rPr>
           <w:b/>
           <w:bCs/>
+          <w:color w:val="005E8F"/>
         </w:rPr>
         <w:t xml:space="preserve">Befund:</w:t>
       </w:r>
@@ -600,6 +881,7 @@
         <w:rPr>
           <w:b/>
           <w:bCs/>
+          <w:color w:val="005E8F"/>
         </w:rPr>
         <w:t xml:space="preserve">Interpretation:</w:t>
       </w:r>
@@ -626,6 +908,7 @@
         <w:rPr>
           <w:b/>
           <w:bCs/>
+          <w:color w:val="005E8F"/>
         </w:rPr>
         <w:t xml:space="preserve">Befund:</w:t>
       </w:r>
@@ -641,6 +924,7 @@
         <w:rPr>
           <w:b/>
           <w:bCs/>
+          <w:color w:val="005E8F"/>
         </w:rPr>
         <w:t xml:space="preserve">Interpretation:</w:t>
       </w:r>
@@ -667,6 +951,7 @@
         <w:rPr>
           <w:b/>
           <w:bCs/>
+          <w:color w:val="005E8F"/>
         </w:rPr>
         <w:t xml:space="preserve">Befund:</w:t>
       </w:r>
@@ -682,6 +967,7 @@
         <w:rPr>
           <w:b/>
           <w:bCs/>
+          <w:color w:val="005E8F"/>
         </w:rPr>
         <w:t xml:space="preserve">Interpretation:</w:t>
       </w:r>
@@ -708,6 +994,7 @@
         <w:rPr>
           <w:b/>
           <w:bCs/>
+          <w:color w:val="005E8F"/>
         </w:rPr>
         <w:t xml:space="preserve">Befund:</w:t>
       </w:r>
@@ -723,6 +1010,7 @@
         <w:rPr>
           <w:b/>
           <w:bCs/>
+          <w:color w:val="005E8F"/>
         </w:rPr>
         <w:t xml:space="preserve">Interpretation:</w:t>
       </w:r>
@@ -749,6 +1037,7 @@
         <w:rPr>
           <w:b/>
           <w:bCs/>
+          <w:color w:val="005E8F"/>
         </w:rPr>
         <w:t xml:space="preserve">Befund:</w:t>
       </w:r>
@@ -764,6 +1053,7 @@
         <w:rPr>
           <w:b/>
           <w:bCs/>
+          <w:color w:val="005E8F"/>
         </w:rPr>
         <w:t xml:space="preserve">Interpretation:</w:t>
       </w:r>
@@ -790,6 +1080,7 @@
         <w:rPr>
           <w:b/>
           <w:bCs/>
+          <w:color w:val="005E8F"/>
         </w:rPr>
         <w:t xml:space="preserve">Befund:</w:t>
       </w:r>
@@ -805,6 +1096,7 @@
         <w:rPr>
           <w:b/>
           <w:bCs/>
+          <w:color w:val="005E8F"/>
         </w:rPr>
         <w:t xml:space="preserve">Spezifische Beobachtungen:</w:t>
       </w:r>
@@ -856,6 +1148,7 @@
         <w:rPr>
           <w:b/>
           <w:bCs/>
+          <w:color w:val="005E8F"/>
         </w:rPr>
         <w:t xml:space="preserve">Interpretation:</w:t>
       </w:r>
@@ -882,6 +1175,7 @@
         <w:rPr>
           <w:b/>
           <w:bCs/>
+          <w:color w:val="005E8F"/>
         </w:rPr>
         <w:t xml:space="preserve">Befund:</w:t>
       </w:r>
@@ -897,6 +1191,7 @@
         <w:rPr>
           <w:b/>
           <w:bCs/>
+          <w:color w:val="005E8F"/>
         </w:rPr>
         <w:t xml:space="preserve">Interpretation:</w:t>
       </w:r>
@@ -917,7 +1212,10 @@
         <w:pStyle w:val="Heading1"/>
         <w:keepNext/>
         <w:keepLines/>
-        <w:spacing w:after="140" w:before="320"/>
+        <w:pBdr>
+          <w:bottom w:val="single" w:color="B8C7D1" w:sz="6" w:space="4"/>
+        </w:pBdr>
+        <w:spacing w:after="160" w:before="360"/>
       </w:pPr>
       <w:r>
         <w:t xml:space="preserve">5. Zusammenfassende Bewertung</w:t>
@@ -1030,12 +1328,12 @@
           <w:tcPr>
             <w:tcW w:type="dxa" w:w="4200"/>
             <w:tcBorders>
-              <w:top w:val="single" w:color="BFBFBF" w:sz="4"/>
-              <w:left w:val="single" w:color="BFBFBF" w:sz="4"/>
-              <w:bottom w:val="single" w:color="BFBFBF" w:sz="4"/>
-              <w:right w:val="single" w:color="BFBFBF" w:sz="4"/>
-            </w:tcBorders>
-            <w:shd w:fill="1F4E79" w:color="auto" w:val="clear"/>
+              <w:top w:val="single" w:color="B8C7D1" w:sz="4"/>
+              <w:left w:val="single" w:color="B8C7D1" w:sz="4"/>
+              <w:bottom w:val="single" w:color="B8C7D1" w:sz="4"/>
+              <w:right w:val="single" w:color="B8C7D1" w:sz="4"/>
+            </w:tcBorders>
+            <w:shd w:fill="005E8F" w:color="auto" w:val="clear"/>
             <w:tcMar>
               <w:top w:type="dxa" w:w="60"/>
               <w:left w:type="dxa" w:w="100"/>
@@ -1060,12 +1358,12 @@
           <w:tcPr>
             <w:tcW w:type="dxa" w:w="2700"/>
             <w:tcBorders>
-              <w:top w:val="single" w:color="BFBFBF" w:sz="4"/>
-              <w:left w:val="single" w:color="BFBFBF" w:sz="4"/>
-              <w:bottom w:val="single" w:color="BFBFBF" w:sz="4"/>
-              <w:right w:val="single" w:color="BFBFBF" w:sz="4"/>
-            </w:tcBorders>
-            <w:shd w:fill="1F4E79" w:color="auto" w:val="clear"/>
+              <w:top w:val="single" w:color="B8C7D1" w:sz="4"/>
+              <w:left w:val="single" w:color="B8C7D1" w:sz="4"/>
+              <w:bottom w:val="single" w:color="B8C7D1" w:sz="4"/>
+              <w:right w:val="single" w:color="B8C7D1" w:sz="4"/>
+            </w:tcBorders>
+            <w:shd w:fill="005E8F" w:color="auto" w:val="clear"/>
             <w:tcMar>
               <w:top w:type="dxa" w:w="60"/>
               <w:left w:type="dxa" w:w="100"/>
@@ -1090,12 +1388,12 @@
           <w:tcPr>
             <w:tcW w:type="dxa" w:w="2126"/>
             <w:tcBorders>
-              <w:top w:val="single" w:color="BFBFBF" w:sz="4"/>
-              <w:left w:val="single" w:color="BFBFBF" w:sz="4"/>
-              <w:bottom w:val="single" w:color="BFBFBF" w:sz="4"/>
-              <w:right w:val="single" w:color="BFBFBF" w:sz="4"/>
-            </w:tcBorders>
-            <w:shd w:fill="1F4E79" w:color="auto" w:val="clear"/>
+              <w:top w:val="single" w:color="B8C7D1" w:sz="4"/>
+              <w:left w:val="single" w:color="B8C7D1" w:sz="4"/>
+              <w:bottom w:val="single" w:color="B8C7D1" w:sz="4"/>
+              <w:right w:val="single" w:color="B8C7D1" w:sz="4"/>
+            </w:tcBorders>
+            <w:shd w:fill="005E8F" w:color="auto" w:val="clear"/>
             <w:tcMar>
               <w:top w:type="dxa" w:w="60"/>
               <w:left w:type="dxa" w:w="100"/>
@@ -1122,11 +1420,12 @@
           <w:tcPr>
             <w:tcW w:type="dxa" w:w="4200"/>
             <w:tcBorders>
-              <w:top w:val="single" w:color="BFBFBF" w:sz="4"/>
-              <w:left w:val="single" w:color="BFBFBF" w:sz="4"/>
-              <w:bottom w:val="single" w:color="BFBFBF" w:sz="4"/>
-              <w:right w:val="single" w:color="BFBFBF" w:sz="4"/>
-            </w:tcBorders>
+              <w:top w:val="single" w:color="B8C7D1" w:sz="4"/>
+              <w:left w:val="single" w:color="B8C7D1" w:sz="4"/>
+              <w:bottom w:val="single" w:color="B8C7D1" w:sz="4"/>
+              <w:right w:val="single" w:color="B8C7D1" w:sz="4"/>
+            </w:tcBorders>
+            <w:shd w:fill="F3F8FB" w:color="auto" w:val="clear"/>
             <w:tcMar>
               <w:top w:type="dxa" w:w="60"/>
               <w:left w:type="dxa" w:w="100"/>
@@ -1150,11 +1449,12 @@
           <w:tcPr>
             <w:tcW w:type="dxa" w:w="2700"/>
             <w:tcBorders>
-              <w:top w:val="single" w:color="BFBFBF" w:sz="4"/>
-              <w:left w:val="single" w:color="BFBFBF" w:sz="4"/>
-              <w:bottom w:val="single" w:color="BFBFBF" w:sz="4"/>
-              <w:right w:val="single" w:color="BFBFBF" w:sz="4"/>
-            </w:tcBorders>
+              <w:top w:val="single" w:color="B8C7D1" w:sz="4"/>
+              <w:left w:val="single" w:color="B8C7D1" w:sz="4"/>
+              <w:bottom w:val="single" w:color="B8C7D1" w:sz="4"/>
+              <w:right w:val="single" w:color="B8C7D1" w:sz="4"/>
+            </w:tcBorders>
+            <w:shd w:fill="F3F8FB" w:color="auto" w:val="clear"/>
             <w:tcMar>
               <w:top w:type="dxa" w:w="60"/>
               <w:left w:type="dxa" w:w="100"/>
@@ -1178,11 +1478,12 @@
           <w:tcPr>
             <w:tcW w:type="dxa" w:w="2126"/>
             <w:tcBorders>
-              <w:top w:val="single" w:color="BFBFBF" w:sz="4"/>
-              <w:left w:val="single" w:color="BFBFBF" w:sz="4"/>
-              <w:bottom w:val="single" w:color="BFBFBF" w:sz="4"/>
-              <w:right w:val="single" w:color="BFBFBF" w:sz="4"/>
-            </w:tcBorders>
+              <w:top w:val="single" w:color="B8C7D1" w:sz="4"/>
+              <w:left w:val="single" w:color="B8C7D1" w:sz="4"/>
+              <w:bottom w:val="single" w:color="B8C7D1" w:sz="4"/>
+              <w:right w:val="single" w:color="B8C7D1" w:sz="4"/>
+            </w:tcBorders>
+            <w:shd w:fill="F3F8FB" w:color="auto" w:val="clear"/>
             <w:tcMar>
               <w:top w:type="dxa" w:w="60"/>
               <w:left w:type="dxa" w:w="100"/>
@@ -1193,8 +1494,9 @@
           <w:p>
             <w:r>
               <w:rPr>
-                <w:b w:val="false"/>
-                <w:bCs w:val="false"/>
+                <w:b/>
+                <w:bCs/>
+                <w:color w:val="005E8F"/>
                 <w:sz w:val="20"/>
                 <w:szCs w:val="20"/>
               </w:rPr>
@@ -1208,11 +1510,12 @@
           <w:tcPr>
             <w:tcW w:type="dxa" w:w="4200"/>
             <w:tcBorders>
-              <w:top w:val="single" w:color="BFBFBF" w:sz="4"/>
-              <w:left w:val="single" w:color="BFBFBF" w:sz="4"/>
-              <w:bottom w:val="single" w:color="BFBFBF" w:sz="4"/>
-              <w:right w:val="single" w:color="BFBFBF" w:sz="4"/>
-            </w:tcBorders>
+              <w:top w:val="single" w:color="B8C7D1" w:sz="4"/>
+              <w:left w:val="single" w:color="B8C7D1" w:sz="4"/>
+              <w:bottom w:val="single" w:color="B8C7D1" w:sz="4"/>
+              <w:right w:val="single" w:color="B8C7D1" w:sz="4"/>
+            </w:tcBorders>
+            <w:shd w:fill="FFFFFF" w:color="auto" w:val="clear"/>
             <w:tcMar>
               <w:top w:type="dxa" w:w="60"/>
               <w:left w:type="dxa" w:w="100"/>
@@ -1236,11 +1539,12 @@
           <w:tcPr>
             <w:tcW w:type="dxa" w:w="2700"/>
             <w:tcBorders>
-              <w:top w:val="single" w:color="BFBFBF" w:sz="4"/>
-              <w:left w:val="single" w:color="BFBFBF" w:sz="4"/>
-              <w:bottom w:val="single" w:color="BFBFBF" w:sz="4"/>
-              <w:right w:val="single" w:color="BFBFBF" w:sz="4"/>
-            </w:tcBorders>
+              <w:top w:val="single" w:color="B8C7D1" w:sz="4"/>
+              <w:left w:val="single" w:color="B8C7D1" w:sz="4"/>
+              <w:bottom w:val="single" w:color="B8C7D1" w:sz="4"/>
+              <w:right w:val="single" w:color="B8C7D1" w:sz="4"/>
+            </w:tcBorders>
+            <w:shd w:fill="FFFFFF" w:color="auto" w:val="clear"/>
             <w:tcMar>
               <w:top w:type="dxa" w:w="60"/>
               <w:left w:type="dxa" w:w="100"/>
@@ -1264,11 +1568,12 @@
           <w:tcPr>
             <w:tcW w:type="dxa" w:w="2126"/>
             <w:tcBorders>
-              <w:top w:val="single" w:color="BFBFBF" w:sz="4"/>
-              <w:left w:val="single" w:color="BFBFBF" w:sz="4"/>
-              <w:bottom w:val="single" w:color="BFBFBF" w:sz="4"/>
-              <w:right w:val="single" w:color="BFBFBF" w:sz="4"/>
-            </w:tcBorders>
+              <w:top w:val="single" w:color="B8C7D1" w:sz="4"/>
+              <w:left w:val="single" w:color="B8C7D1" w:sz="4"/>
+              <w:bottom w:val="single" w:color="B8C7D1" w:sz="4"/>
+              <w:right w:val="single" w:color="B8C7D1" w:sz="4"/>
+            </w:tcBorders>
+            <w:shd w:fill="FFFFFF" w:color="auto" w:val="clear"/>
             <w:tcMar>
               <w:top w:type="dxa" w:w="60"/>
               <w:left w:type="dxa" w:w="100"/>
@@ -1279,8 +1584,9 @@
           <w:p>
             <w:r>
               <w:rPr>
-                <w:b w:val="false"/>
-                <w:bCs w:val="false"/>
+                <w:b/>
+                <w:bCs/>
+                <w:color w:val="005E8F"/>
                 <w:sz w:val="20"/>
                 <w:szCs w:val="20"/>
               </w:rPr>
@@ -1294,11 +1600,12 @@
           <w:tcPr>
             <w:tcW w:type="dxa" w:w="4200"/>
             <w:tcBorders>
-              <w:top w:val="single" w:color="BFBFBF" w:sz="4"/>
-              <w:left w:val="single" w:color="BFBFBF" w:sz="4"/>
-              <w:bottom w:val="single" w:color="BFBFBF" w:sz="4"/>
-              <w:right w:val="single" w:color="BFBFBF" w:sz="4"/>
-            </w:tcBorders>
+              <w:top w:val="single" w:color="B8C7D1" w:sz="4"/>
+              <w:left w:val="single" w:color="B8C7D1" w:sz="4"/>
+              <w:bottom w:val="single" w:color="B8C7D1" w:sz="4"/>
+              <w:right w:val="single" w:color="B8C7D1" w:sz="4"/>
+            </w:tcBorders>
+            <w:shd w:fill="F3F8FB" w:color="auto" w:val="clear"/>
             <w:tcMar>
               <w:top w:type="dxa" w:w="60"/>
               <w:left w:type="dxa" w:w="100"/>
@@ -1322,11 +1629,12 @@
           <w:tcPr>
             <w:tcW w:type="dxa" w:w="2700"/>
             <w:tcBorders>
-              <w:top w:val="single" w:color="BFBFBF" w:sz="4"/>
-              <w:left w:val="single" w:color="BFBFBF" w:sz="4"/>
-              <w:bottom w:val="single" w:color="BFBFBF" w:sz="4"/>
-              <w:right w:val="single" w:color="BFBFBF" w:sz="4"/>
-            </w:tcBorders>
+              <w:top w:val="single" w:color="B8C7D1" w:sz="4"/>
+              <w:left w:val="single" w:color="B8C7D1" w:sz="4"/>
+              <w:bottom w:val="single" w:color="B8C7D1" w:sz="4"/>
+              <w:right w:val="single" w:color="B8C7D1" w:sz="4"/>
+            </w:tcBorders>
+            <w:shd w:fill="F3F8FB" w:color="auto" w:val="clear"/>
             <w:tcMar>
               <w:top w:type="dxa" w:w="60"/>
               <w:left w:type="dxa" w:w="100"/>
@@ -1350,11 +1658,12 @@
           <w:tcPr>
             <w:tcW w:type="dxa" w:w="2126"/>
             <w:tcBorders>
-              <w:top w:val="single" w:color="BFBFBF" w:sz="4"/>
-              <w:left w:val="single" w:color="BFBFBF" w:sz="4"/>
-              <w:bottom w:val="single" w:color="BFBFBF" w:sz="4"/>
-              <w:right w:val="single" w:color="BFBFBF" w:sz="4"/>
-            </w:tcBorders>
+              <w:top w:val="single" w:color="B8C7D1" w:sz="4"/>
+              <w:left w:val="single" w:color="B8C7D1" w:sz="4"/>
+              <w:bottom w:val="single" w:color="B8C7D1" w:sz="4"/>
+              <w:right w:val="single" w:color="B8C7D1" w:sz="4"/>
+            </w:tcBorders>
+            <w:shd w:fill="F3F8FB" w:color="auto" w:val="clear"/>
             <w:tcMar>
               <w:top w:type="dxa" w:w="60"/>
               <w:left w:type="dxa" w:w="100"/>
@@ -1380,11 +1689,12 @@
           <w:tcPr>
             <w:tcW w:type="dxa" w:w="4200"/>
             <w:tcBorders>
-              <w:top w:val="single" w:color="BFBFBF" w:sz="4"/>
-              <w:left w:val="single" w:color="BFBFBF" w:sz="4"/>
-              <w:bottom w:val="single" w:color="BFBFBF" w:sz="4"/>
-              <w:right w:val="single" w:color="BFBFBF" w:sz="4"/>
-            </w:tcBorders>
+              <w:top w:val="single" w:color="B8C7D1" w:sz="4"/>
+              <w:left w:val="single" w:color="B8C7D1" w:sz="4"/>
+              <w:bottom w:val="single" w:color="B8C7D1" w:sz="4"/>
+              <w:right w:val="single" w:color="B8C7D1" w:sz="4"/>
+            </w:tcBorders>
+            <w:shd w:fill="FFFFFF" w:color="auto" w:val="clear"/>
             <w:tcMar>
               <w:top w:type="dxa" w:w="60"/>
               <w:left w:type="dxa" w:w="100"/>
@@ -1408,11 +1718,12 @@
           <w:tcPr>
             <w:tcW w:type="dxa" w:w="2700"/>
             <w:tcBorders>
-              <w:top w:val="single" w:color="BFBFBF" w:sz="4"/>
-              <w:left w:val="single" w:color="BFBFBF" w:sz="4"/>
-              <w:bottom w:val="single" w:color="BFBFBF" w:sz="4"/>
-              <w:right w:val="single" w:color="BFBFBF" w:sz="4"/>
-            </w:tcBorders>
+              <w:top w:val="single" w:color="B8C7D1" w:sz="4"/>
+              <w:left w:val="single" w:color="B8C7D1" w:sz="4"/>
+              <w:bottom w:val="single" w:color="B8C7D1" w:sz="4"/>
+              <w:right w:val="single" w:color="B8C7D1" w:sz="4"/>
+            </w:tcBorders>
+            <w:shd w:fill="FFFFFF" w:color="auto" w:val="clear"/>
             <w:tcMar>
               <w:top w:type="dxa" w:w="60"/>
               <w:left w:type="dxa" w:w="100"/>
@@ -1436,11 +1747,12 @@
           <w:tcPr>
             <w:tcW w:type="dxa" w:w="2126"/>
             <w:tcBorders>
-              <w:top w:val="single" w:color="BFBFBF" w:sz="4"/>
-              <w:left w:val="single" w:color="BFBFBF" w:sz="4"/>
-              <w:bottom w:val="single" w:color="BFBFBF" w:sz="4"/>
-              <w:right w:val="single" w:color="BFBFBF" w:sz="4"/>
-            </w:tcBorders>
+              <w:top w:val="single" w:color="B8C7D1" w:sz="4"/>
+              <w:left w:val="single" w:color="B8C7D1" w:sz="4"/>
+              <w:bottom w:val="single" w:color="B8C7D1" w:sz="4"/>
+              <w:right w:val="single" w:color="B8C7D1" w:sz="4"/>
+            </w:tcBorders>
+            <w:shd w:fill="FFFFFF" w:color="auto" w:val="clear"/>
             <w:tcMar>
               <w:top w:type="dxa" w:w="60"/>
               <w:left w:type="dxa" w:w="100"/>
@@ -1466,11 +1778,12 @@
           <w:tcPr>
             <w:tcW w:type="dxa" w:w="4200"/>
             <w:tcBorders>
-              <w:top w:val="single" w:color="BFBFBF" w:sz="4"/>
-              <w:left w:val="single" w:color="BFBFBF" w:sz="4"/>
-              <w:bottom w:val="single" w:color="BFBFBF" w:sz="4"/>
-              <w:right w:val="single" w:color="BFBFBF" w:sz="4"/>
-            </w:tcBorders>
+              <w:top w:val="single" w:color="B8C7D1" w:sz="4"/>
+              <w:left w:val="single" w:color="B8C7D1" w:sz="4"/>
+              <w:bottom w:val="single" w:color="B8C7D1" w:sz="4"/>
+              <w:right w:val="single" w:color="B8C7D1" w:sz="4"/>
+            </w:tcBorders>
+            <w:shd w:fill="F3F8FB" w:color="auto" w:val="clear"/>
             <w:tcMar>
               <w:top w:type="dxa" w:w="60"/>
               <w:left w:type="dxa" w:w="100"/>
@@ -1494,11 +1807,12 @@
           <w:tcPr>
             <w:tcW w:type="dxa" w:w="2700"/>
             <w:tcBorders>
-              <w:top w:val="single" w:color="BFBFBF" w:sz="4"/>
-              <w:left w:val="single" w:color="BFBFBF" w:sz="4"/>
-              <w:bottom w:val="single" w:color="BFBFBF" w:sz="4"/>
-              <w:right w:val="single" w:color="BFBFBF" w:sz="4"/>
-            </w:tcBorders>
+              <w:top w:val="single" w:color="B8C7D1" w:sz="4"/>
+              <w:left w:val="single" w:color="B8C7D1" w:sz="4"/>
+              <w:bottom w:val="single" w:color="B8C7D1" w:sz="4"/>
+              <w:right w:val="single" w:color="B8C7D1" w:sz="4"/>
+            </w:tcBorders>
+            <w:shd w:fill="F3F8FB" w:color="auto" w:val="clear"/>
             <w:tcMar>
               <w:top w:type="dxa" w:w="60"/>
               <w:left w:type="dxa" w:w="100"/>
@@ -1522,11 +1836,12 @@
           <w:tcPr>
             <w:tcW w:type="dxa" w:w="2126"/>
             <w:tcBorders>
-              <w:top w:val="single" w:color="BFBFBF" w:sz="4"/>
-              <w:left w:val="single" w:color="BFBFBF" w:sz="4"/>
-              <w:bottom w:val="single" w:color="BFBFBF" w:sz="4"/>
-              <w:right w:val="single" w:color="BFBFBF" w:sz="4"/>
-            </w:tcBorders>
+              <w:top w:val="single" w:color="B8C7D1" w:sz="4"/>
+              <w:left w:val="single" w:color="B8C7D1" w:sz="4"/>
+              <w:bottom w:val="single" w:color="B8C7D1" w:sz="4"/>
+              <w:right w:val="single" w:color="B8C7D1" w:sz="4"/>
+            </w:tcBorders>
+            <w:shd w:fill="F3F8FB" w:color="auto" w:val="clear"/>
             <w:tcMar>
               <w:top w:type="dxa" w:w="60"/>
               <w:left w:type="dxa" w:w="100"/>
@@ -1552,11 +1867,12 @@
           <w:tcPr>
             <w:tcW w:type="dxa" w:w="4200"/>
             <w:tcBorders>
-              <w:top w:val="single" w:color="BFBFBF" w:sz="4"/>
-              <w:left w:val="single" w:color="BFBFBF" w:sz="4"/>
-              <w:bottom w:val="single" w:color="BFBFBF" w:sz="4"/>
-              <w:right w:val="single" w:color="BFBFBF" w:sz="4"/>
-            </w:tcBorders>
+              <w:top w:val="single" w:color="B8C7D1" w:sz="4"/>
+              <w:left w:val="single" w:color="B8C7D1" w:sz="4"/>
+              <w:bottom w:val="single" w:color="B8C7D1" w:sz="4"/>
+              <w:right w:val="single" w:color="B8C7D1" w:sz="4"/>
+            </w:tcBorders>
+            <w:shd w:fill="FFFFFF" w:color="auto" w:val="clear"/>
             <w:tcMar>
               <w:top w:type="dxa" w:w="60"/>
               <w:left w:type="dxa" w:w="100"/>
@@ -1580,11 +1896,12 @@
           <w:tcPr>
             <w:tcW w:type="dxa" w:w="2700"/>
             <w:tcBorders>
-              <w:top w:val="single" w:color="BFBFBF" w:sz="4"/>
-              <w:left w:val="single" w:color="BFBFBF" w:sz="4"/>
-              <w:bottom w:val="single" w:color="BFBFBF" w:sz="4"/>
-              <w:right w:val="single" w:color="BFBFBF" w:sz="4"/>
-            </w:tcBorders>
+              <w:top w:val="single" w:color="B8C7D1" w:sz="4"/>
+              <w:left w:val="single" w:color="B8C7D1" w:sz="4"/>
+              <w:bottom w:val="single" w:color="B8C7D1" w:sz="4"/>
+              <w:right w:val="single" w:color="B8C7D1" w:sz="4"/>
+            </w:tcBorders>
+            <w:shd w:fill="FFFFFF" w:color="auto" w:val="clear"/>
             <w:tcMar>
               <w:top w:type="dxa" w:w="60"/>
               <w:left w:type="dxa" w:w="100"/>
@@ -1608,11 +1925,12 @@
           <w:tcPr>
             <w:tcW w:type="dxa" w:w="2126"/>
             <w:tcBorders>
-              <w:top w:val="single" w:color="BFBFBF" w:sz="4"/>
-              <w:left w:val="single" w:color="BFBFBF" w:sz="4"/>
-              <w:bottom w:val="single" w:color="BFBFBF" w:sz="4"/>
-              <w:right w:val="single" w:color="BFBFBF" w:sz="4"/>
-            </w:tcBorders>
+              <w:top w:val="single" w:color="B8C7D1" w:sz="4"/>
+              <w:left w:val="single" w:color="B8C7D1" w:sz="4"/>
+              <w:bottom w:val="single" w:color="B8C7D1" w:sz="4"/>
+              <w:right w:val="single" w:color="B8C7D1" w:sz="4"/>
+            </w:tcBorders>
+            <w:shd w:fill="FFFFFF" w:color="auto" w:val="clear"/>
             <w:tcMar>
               <w:top w:type="dxa" w:w="60"/>
               <w:left w:type="dxa" w:w="100"/>
@@ -1638,11 +1956,12 @@
           <w:tcPr>
             <w:tcW w:type="dxa" w:w="4200"/>
             <w:tcBorders>
-              <w:top w:val="single" w:color="BFBFBF" w:sz="4"/>
-              <w:left w:val="single" w:color="BFBFBF" w:sz="4"/>
-              <w:bottom w:val="single" w:color="BFBFBF" w:sz="4"/>
-              <w:right w:val="single" w:color="BFBFBF" w:sz="4"/>
-            </w:tcBorders>
+              <w:top w:val="single" w:color="B8C7D1" w:sz="4"/>
+              <w:left w:val="single" w:color="B8C7D1" w:sz="4"/>
+              <w:bottom w:val="single" w:color="B8C7D1" w:sz="4"/>
+              <w:right w:val="single" w:color="B8C7D1" w:sz="4"/>
+            </w:tcBorders>
+            <w:shd w:fill="F3F8FB" w:color="auto" w:val="clear"/>
             <w:tcMar>
               <w:top w:type="dxa" w:w="60"/>
               <w:left w:type="dxa" w:w="100"/>
@@ -1666,11 +1985,12 @@
           <w:tcPr>
             <w:tcW w:type="dxa" w:w="2700"/>
             <w:tcBorders>
-              <w:top w:val="single" w:color="BFBFBF" w:sz="4"/>
-              <w:left w:val="single" w:color="BFBFBF" w:sz="4"/>
-              <w:bottom w:val="single" w:color="BFBFBF" w:sz="4"/>
-              <w:right w:val="single" w:color="BFBFBF" w:sz="4"/>
-            </w:tcBorders>
+              <w:top w:val="single" w:color="B8C7D1" w:sz="4"/>
+              <w:left w:val="single" w:color="B8C7D1" w:sz="4"/>
+              <w:bottom w:val="single" w:color="B8C7D1" w:sz="4"/>
+              <w:right w:val="single" w:color="B8C7D1" w:sz="4"/>
+            </w:tcBorders>
+            <w:shd w:fill="F3F8FB" w:color="auto" w:val="clear"/>
             <w:tcMar>
               <w:top w:type="dxa" w:w="60"/>
               <w:left w:type="dxa" w:w="100"/>
@@ -1694,11 +2014,12 @@
           <w:tcPr>
             <w:tcW w:type="dxa" w:w="2126"/>
             <w:tcBorders>
-              <w:top w:val="single" w:color="BFBFBF" w:sz="4"/>
-              <w:left w:val="single" w:color="BFBFBF" w:sz="4"/>
-              <w:bottom w:val="single" w:color="BFBFBF" w:sz="4"/>
-              <w:right w:val="single" w:color="BFBFBF" w:sz="4"/>
-            </w:tcBorders>
+              <w:top w:val="single" w:color="B8C7D1" w:sz="4"/>
+              <w:left w:val="single" w:color="B8C7D1" w:sz="4"/>
+              <w:bottom w:val="single" w:color="B8C7D1" w:sz="4"/>
+              <w:right w:val="single" w:color="B8C7D1" w:sz="4"/>
+            </w:tcBorders>
+            <w:shd w:fill="F3F8FB" w:color="auto" w:val="clear"/>
             <w:tcMar>
               <w:top w:type="dxa" w:w="60"/>
               <w:left w:type="dxa" w:w="100"/>
@@ -1724,11 +2045,12 @@
           <w:tcPr>
             <w:tcW w:type="dxa" w:w="4200"/>
             <w:tcBorders>
-              <w:top w:val="single" w:color="BFBFBF" w:sz="4"/>
-              <w:left w:val="single" w:color="BFBFBF" w:sz="4"/>
-              <w:bottom w:val="single" w:color="BFBFBF" w:sz="4"/>
-              <w:right w:val="single" w:color="BFBFBF" w:sz="4"/>
-            </w:tcBorders>
+              <w:top w:val="single" w:color="B8C7D1" w:sz="4"/>
+              <w:left w:val="single" w:color="B8C7D1" w:sz="4"/>
+              <w:bottom w:val="single" w:color="B8C7D1" w:sz="4"/>
+              <w:right w:val="single" w:color="B8C7D1" w:sz="4"/>
+            </w:tcBorders>
+            <w:shd w:fill="FFFFFF" w:color="auto" w:val="clear"/>
             <w:tcMar>
               <w:top w:type="dxa" w:w="60"/>
               <w:left w:type="dxa" w:w="100"/>
@@ -1752,11 +2074,12 @@
           <w:tcPr>
             <w:tcW w:type="dxa" w:w="2700"/>
             <w:tcBorders>
-              <w:top w:val="single" w:color="BFBFBF" w:sz="4"/>
-              <w:left w:val="single" w:color="BFBFBF" w:sz="4"/>
-              <w:bottom w:val="single" w:color="BFBFBF" w:sz="4"/>
-              <w:right w:val="single" w:color="BFBFBF" w:sz="4"/>
-            </w:tcBorders>
+              <w:top w:val="single" w:color="B8C7D1" w:sz="4"/>
+              <w:left w:val="single" w:color="B8C7D1" w:sz="4"/>
+              <w:bottom w:val="single" w:color="B8C7D1" w:sz="4"/>
+              <w:right w:val="single" w:color="B8C7D1" w:sz="4"/>
+            </w:tcBorders>
+            <w:shd w:fill="FFFFFF" w:color="auto" w:val="clear"/>
             <w:tcMar>
               <w:top w:type="dxa" w:w="60"/>
               <w:left w:type="dxa" w:w="100"/>
@@ -1780,11 +2103,12 @@
           <w:tcPr>
             <w:tcW w:type="dxa" w:w="2126"/>
             <w:tcBorders>
-              <w:top w:val="single" w:color="BFBFBF" w:sz="4"/>
-              <w:left w:val="single" w:color="BFBFBF" w:sz="4"/>
-              <w:bottom w:val="single" w:color="BFBFBF" w:sz="4"/>
-              <w:right w:val="single" w:color="BFBFBF" w:sz="4"/>
-            </w:tcBorders>
+              <w:top w:val="single" w:color="B8C7D1" w:sz="4"/>
+              <w:left w:val="single" w:color="B8C7D1" w:sz="4"/>
+              <w:bottom w:val="single" w:color="B8C7D1" w:sz="4"/>
+              <w:right w:val="single" w:color="B8C7D1" w:sz="4"/>
+            </w:tcBorders>
+            <w:shd w:fill="FFFFFF" w:color="auto" w:val="clear"/>
             <w:tcMar>
               <w:top w:type="dxa" w:w="60"/>
               <w:left w:type="dxa" w:w="100"/>
@@ -1810,11 +2134,12 @@
           <w:tcPr>
             <w:tcW w:type="dxa" w:w="4200"/>
             <w:tcBorders>
-              <w:top w:val="single" w:color="BFBFBF" w:sz="4"/>
-              <w:left w:val="single" w:color="BFBFBF" w:sz="4"/>
-              <w:bottom w:val="single" w:color="BFBFBF" w:sz="4"/>
-              <w:right w:val="single" w:color="BFBFBF" w:sz="4"/>
-            </w:tcBorders>
+              <w:top w:val="single" w:color="B8C7D1" w:sz="4"/>
+              <w:left w:val="single" w:color="B8C7D1" w:sz="4"/>
+              <w:bottom w:val="single" w:color="B8C7D1" w:sz="4"/>
+              <w:right w:val="single" w:color="B8C7D1" w:sz="4"/>
+            </w:tcBorders>
+            <w:shd w:fill="F3F8FB" w:color="auto" w:val="clear"/>
             <w:tcMar>
               <w:top w:type="dxa" w:w="60"/>
               <w:left w:type="dxa" w:w="100"/>
@@ -1838,11 +2163,12 @@
           <w:tcPr>
             <w:tcW w:type="dxa" w:w="2700"/>
             <w:tcBorders>
-              <w:top w:val="single" w:color="BFBFBF" w:sz="4"/>
-              <w:left w:val="single" w:color="BFBFBF" w:sz="4"/>
-              <w:bottom w:val="single" w:color="BFBFBF" w:sz="4"/>
-              <w:right w:val="single" w:color="BFBFBF" w:sz="4"/>
-            </w:tcBorders>
+              <w:top w:val="single" w:color="B8C7D1" w:sz="4"/>
+              <w:left w:val="single" w:color="B8C7D1" w:sz="4"/>
+              <w:bottom w:val="single" w:color="B8C7D1" w:sz="4"/>
+              <w:right w:val="single" w:color="B8C7D1" w:sz="4"/>
+            </w:tcBorders>
+            <w:shd w:fill="F3F8FB" w:color="auto" w:val="clear"/>
             <w:tcMar>
               <w:top w:type="dxa" w:w="60"/>
               <w:left w:type="dxa" w:w="100"/>
@@ -1866,11 +2192,12 @@
           <w:tcPr>
             <w:tcW w:type="dxa" w:w="2126"/>
             <w:tcBorders>
-              <w:top w:val="single" w:color="BFBFBF" w:sz="4"/>
-              <w:left w:val="single" w:color="BFBFBF" w:sz="4"/>
-              <w:bottom w:val="single" w:color="BFBFBF" w:sz="4"/>
-              <w:right w:val="single" w:color="BFBFBF" w:sz="4"/>
-            </w:tcBorders>
+              <w:top w:val="single" w:color="B8C7D1" w:sz="4"/>
+              <w:left w:val="single" w:color="B8C7D1" w:sz="4"/>
+              <w:bottom w:val="single" w:color="B8C7D1" w:sz="4"/>
+              <w:right w:val="single" w:color="B8C7D1" w:sz="4"/>
+            </w:tcBorders>
+            <w:shd w:fill="F3F8FB" w:color="auto" w:val="clear"/>
             <w:tcMar>
               <w:top w:type="dxa" w:w="60"/>
               <w:left w:type="dxa" w:w="100"/>
@@ -1999,7 +2326,10 @@
         <w:pStyle w:val="Heading1"/>
         <w:keepNext/>
         <w:keepLines/>
-        <w:spacing w:after="140" w:before="320"/>
+        <w:pBdr>
+          <w:bottom w:val="single" w:color="B8C7D1" w:sz="6" w:space="4"/>
+        </w:pBdr>
+        <w:spacing w:after="160" w:before="360"/>
       </w:pPr>
       <w:r>
         <w:t xml:space="preserve">6. Empfehlungen für die Förderplanung</w:t>
@@ -2032,6 +2362,7 @@
         <w:rPr>
           <w:b/>
           <w:bCs/>
+          <w:color w:val="005E8F"/>
         </w:rPr>
         <w:t xml:space="preserve">1. Binokular- und Augenmotoriktraining (Priorität: sehr hoch)</w:t>
       </w:r>
@@ -2083,6 +2414,7 @@
         <w:rPr>
           <w:b/>
           <w:bCs/>
+          <w:color w:val="005E8F"/>
         </w:rPr>
         <w:t xml:space="preserve">2. Lesebezogenes Blicktraining (Priorität: sehr hoch)</w:t>
       </w:r>
@@ -2134,6 +2466,7 @@
         <w:rPr>
           <w:b/>
           <w:bCs/>
+          <w:color w:val="005E8F"/>
         </w:rPr>
         <w:t xml:space="preserve">3. Soziales Lernen und Gruppenfähigkeit (Priorität: hoch)</w:t>
       </w:r>
@@ -2185,6 +2518,7 @@
         <w:rPr>
           <w:b/>
           <w:bCs/>
+          <w:color w:val="005E8F"/>
         </w:rPr>
         <w:t xml:space="preserve">4. Aufmerksamkeits- und Konzentrationstraining (Priorität: hoch)</w:t>
       </w:r>
@@ -2236,6 +2570,7 @@
         <w:rPr>
           <w:b/>
           <w:bCs/>
+          <w:color w:val="005E8F"/>
         </w:rPr>
         <w:t xml:space="preserve">5. Koordinatives Basistraining (Priorität: hoch)</w:t>
       </w:r>
@@ -2303,6 +2638,7 @@
         <w:rPr>
           <w:b/>
           <w:bCs/>
+          <w:color w:val="005E8F"/>
         </w:rPr>
         <w:t xml:space="preserve">Kleinschrittige Progression:</w:t>
       </w:r>
@@ -2323,6 +2659,7 @@
         <w:rPr>
           <w:b/>
           <w:bCs/>
+          <w:color w:val="005E8F"/>
         </w:rPr>
         <w:t xml:space="preserve">Kurze Übungseinheiten:</w:t>
       </w:r>
@@ -2343,6 +2680,7 @@
         <w:rPr>
           <w:b/>
           <w:bCs/>
+          <w:color w:val="005E8F"/>
         </w:rPr>
         <w:t xml:space="preserve">Wiederholung und Automatisierung:</w:t>
       </w:r>
@@ -2363,6 +2701,7 @@
         <w:rPr>
           <w:b/>
           <w:bCs/>
+          <w:color w:val="005E8F"/>
         </w:rPr>
         <w:t xml:space="preserve">Spielerische Vermittlung:</w:t>
       </w:r>
@@ -2383,6 +2722,7 @@
         <w:rPr>
           <w:b/>
           <w:bCs/>
+          <w:color w:val="005E8F"/>
         </w:rPr>
         <w:t xml:space="preserve">Positive Verstärkung:</w:t>
       </w:r>
@@ -2403,6 +2743,7 @@
         <w:rPr>
           <w:b/>
           <w:bCs/>
+          <w:color w:val="005E8F"/>
         </w:rPr>
         <w:t xml:space="preserve">Klare Struktur:</w:t>
       </w:r>
@@ -2478,7 +2819,10 @@
         <w:pStyle w:val="Heading1"/>
         <w:keepNext/>
         <w:keepLines/>
-        <w:spacing w:after="140" w:before="320"/>
+        <w:pBdr>
+          <w:bottom w:val="single" w:color="B8C7D1" w:sz="6" w:space="4"/>
+        </w:pBdr>
+        <w:spacing w:after="160" w:before="360"/>
       </w:pPr>
       <w:r>
         <w:t xml:space="preserve">7. Abschließende Bewertung</w:t>
@@ -2509,9 +2853,10 @@
       </w:r>
     </w:p>
     <w:sectPr>
-      <w:footerReference w:type="default" r:id="rId7"/>
+      <w:headerReference w:type="default" r:id="rId7"/>
+      <w:footerReference w:type="default" r:id="rId8"/>
       <w:pgSz w:w="11906" w:h="16838" w:orient="portrait"/>
-      <w:pgMar w:top="1300" w:right="1440" w:bottom="1300" w:left="1440" w:header="708" w:footer="708" w:gutter="0"/>
+      <w:pgMar w:top="1700" w:right="1440" w:bottom="1300" w:left="1440" w:header="500" w:footer="708" w:gutter="0"/>
       <w:pgNumType/>
       <w:docGrid w:linePitch="360"/>
     </w:sectPr>
@@ -2568,15 +2913,25 @@
     </w:pPr>
     <w:r>
       <w:rPr>
-        <w:color w:val="808080"/>
+        <w:b/>
+        <w:bCs/>
+        <w:color w:val="005E8F"/>
         <w:sz w:val="16"/>
         <w:szCs w:val="16"/>
       </w:rPr>
-      <w:t xml:space="preserve">Kids for success · Eingangsevaluation Iserlohn · 25.09.2026 · Seite </w:t>
+      <w:t xml:space="preserve">BVKT e.V.</w:t>
     </w:r>
     <w:r>
       <w:rPr>
-        <w:color w:val="808080"/>
+        <w:color w:val="8A8A8A"/>
+        <w:sz w:val="16"/>
+        <w:szCs w:val="16"/>
+      </w:rPr>
+      <w:t xml:space="preserve">  ·  Kids for success  ·  Eingangsevaluation Iserlohn  ·  25.09.2026  ·  Seite </w:t>
+    </w:r>
+    <w:r>
+      <w:rPr>
+        <w:color w:val="8A8A8A"/>
         <w:sz w:val="16"/>
         <w:szCs w:val="16"/>
       </w:rPr>
@@ -2626,6 +2981,56 @@
 </w:footnotes>
 </file>
 
+<file path=word/header1.xml><?xml version="1.0" encoding="utf-8"?>
+<w:hdr xmlns:wpc="http://schemas.microsoft.com/office/word/2010/wordprocessingCanvas" xmlns:mc="http://schemas.openxmlformats.org/markup-compatibility/2006" xmlns:o="urn:schemas-microsoft-com:office:office" xmlns:r="http://schemas.openxmlformats.org/officeDocument/2006/relationships" xmlns:m="http://schemas.openxmlformats.org/officeDocument/2006/math" xmlns:v="urn:schemas-microsoft-com:vml" xmlns:wp14="http://schemas.microsoft.com/office/word/2010/wordprocessingDrawing" xmlns:wp="http://schemas.openxmlformats.org/drawingml/2006/wordprocessingDrawing" xmlns:w10="urn:schemas-microsoft-com:office:word" xmlns:w="http://schemas.openxmlformats.org/wordprocessingml/2006/main" xmlns:w14="http://schemas.microsoft.com/office/word/2010/wordml" xmlns:w15="http://schemas.microsoft.com/office/word/2012/wordml" xmlns:wpg="http://schemas.microsoft.com/office/word/2010/wordprocessingGroup" xmlns:wpi="http://schemas.microsoft.com/office/word/2010/wordprocessingInk" xmlns:wne="http://schemas.microsoft.com/office/word/2006/wordml" xmlns:wps="http://schemas.microsoft.com/office/word/2010/wordprocessingShape" xmlns:cx="http://schemas.microsoft.com/office/drawing/2014/chartex" xmlns:cx1="http://schemas.microsoft.com/office/drawing/2015/9/8/chartex" xmlns:cx2="http://schemas.microsoft.com/office/drawing/2015/10/21/chartex" xmlns:cx3="http://schemas.microsoft.com/office/drawing/2016/5/9/chartex" xmlns:cx4="http://schemas.microsoft.com/office/drawing/2016/5/10/chartex" xmlns:cx5="http://schemas.microsoft.com/office/drawing/2016/5/11/chartex" xmlns:cx6="http://schemas.microsoft.com/office/drawing/2016/5/12/chartex" xmlns:cx7="http://schemas.microsoft.com/office/drawing/2016/5/13/chartex" xmlns:cx8="http://schemas.microsoft.com/office/drawing/2016/5/14/chartex" xmlns:w16cid="http://schemas.microsoft.com/office/word/2016/wordml/cid" xmlns:w16se="http://schemas.microsoft.com/office/word/2015/wordml/symex">
+  <w:p>
+    <w:pPr>
+      <w:jc w:val="right"/>
+    </w:pPr>
+    <w:r>
+      <w:drawing>
+        <wp:inline distT="0" distB="0" distL="0" distR="0">
+          <wp:extent cx="590550" cy="590550"/>
+          <wp:effectExtent t="0" r="0" b="0" l="0"/>
+          <wp:docPr id="1" name="BVKT Logo" descr="Logo BVKT e.V." title="BVKT e.V."/>
+          <wp:cNvGraphicFramePr>
+            <a:graphicFrameLocks xmlns:a="http://schemas.openxmlformats.org/drawingml/2006/main" noChangeAspect="1"/>
+          </wp:cNvGraphicFramePr>
+          <a:graphic xmlns:a="http://schemas.openxmlformats.org/drawingml/2006/main">
+            <a:graphicData uri="http://schemas.openxmlformats.org/drawingml/2006/picture">
+              <pic:pic xmlns:pic="http://schemas.openxmlformats.org/drawingml/2006/picture">
+                <pic:nvPicPr>
+                  <pic:cNvPr id="0" name="" descr=""/>
+                  <pic:cNvPicPr>
+                    <a:picLocks noChangeAspect="1" noChangeArrowheads="1"/>
+                  </pic:cNvPicPr>
+                </pic:nvPicPr>
+                <pic:blipFill>
+                  <a:blip r:embed="rId0" cstate="none"/>
+                  <a:srcRect/>
+                  <a:stretch>
+                    <a:fillRect/>
+                  </a:stretch>
+                </pic:blipFill>
+                <pic:spPr bwMode="auto">
+                  <a:xfrm>
+                    <a:off x="0" y="0"/>
+                    <a:ext cx="590550" cy="590550"/>
+                  </a:xfrm>
+                  <a:prstGeom prst="rect">
+                    <a:avLst/>
+                  </a:prstGeom>
+                </pic:spPr>
+              </pic:pic>
+            </a:graphicData>
+          </a:graphic>
+        </wp:inline>
+      </w:drawing>
+    </w:r>
+  </w:p>
+</w:hdr>
+</file>
+
 <file path=word/numbering.xml><?xml version="1.0" encoding="utf-8"?>
 <w:numbering xmlns:wpc="http://schemas.microsoft.com/office/word/2010/wordprocessingCanvas" xmlns:mc="http://schemas.openxmlformats.org/markup-compatibility/2006" xmlns:o="urn:schemas-microsoft-com:office:office" xmlns:r="http://schemas.openxmlformats.org/officeDocument/2006/relationships" xmlns:m="http://schemas.openxmlformats.org/officeDocument/2006/math" xmlns:v="urn:schemas-microsoft-com:vml" xmlns:wp14="http://schemas.microsoft.com/office/word/2010/wordprocessingDrawing" xmlns:wp="http://schemas.openxmlformats.org/drawingml/2006/wordprocessingDrawing" xmlns:w10="urn:schemas-microsoft-com:office:word" xmlns:w="http://schemas.openxmlformats.org/wordprocessingml/2006/main" xmlns:w14="http://schemas.microsoft.com/office/word/2010/wordml" xmlns:w15="http://schemas.microsoft.com/office/word/2012/wordml" xmlns:wpg="http://schemas.microsoft.com/office/word/2010/wordprocessingGroup" xmlns:wpi="http://schemas.microsoft.com/office/word/2010/wordprocessingInk" xmlns:wne="http://schemas.microsoft.com/office/word/2006/wordml" xmlns:wps="http://schemas.microsoft.com/office/word/2010/wordprocessingShape" mc:Ignorable="w14 w15 wp14">
   <w:abstractNum w:abstractNumId="1" w15:restartNumberingAfterBreak="0">
@@ -2717,11 +3122,16 @@
     <w:lvl w:ilvl="0" w15:tentative="1">
       <w:start w:val="1"/>
       <w:numFmt w:val="bullet"/>
-      <w:lvlText w:val="•"/>
+      <w:lvlText w:val="■"/>
       <w:lvlJc w:val="left"/>
       <w:pPr>
         <w:ind w:left="720" w:hanging="360"/>
       </w:pPr>
+      <w:rPr>
+        <w:color w:val="FBAF3F"/>
+        <w:sz w:val="16"/>
+        <w:szCs w:val="16"/>
+      </w:rPr>
     </w:lvl>
   </w:abstractNum>
   <w:abstractNum w:abstractNumId="3" w15:restartNumberingAfterBreak="0">
@@ -2734,6 +3144,11 @@
       <w:pPr>
         <w:ind w:left="720" w:hanging="360"/>
       </w:pPr>
+      <w:rPr>
+        <w:b/>
+        <w:bCs/>
+        <w:color w:val="005E8F"/>
+      </w:rPr>
     </w:lvl>
   </w:abstractNum>
   <w:abstractNum w:abstractNumId="4" w15:restartNumberingAfterBreak="0">
@@ -2746,6 +3161,11 @@
       <w:pPr>
         <w:ind w:left="720" w:hanging="360"/>
       </w:pPr>
+      <w:rPr>
+        <w:b/>
+        <w:bCs/>
+        <w:color w:val="005E8F"/>
+      </w:rPr>
     </w:lvl>
   </w:abstractNum>
   <w:num w:numId="1">
@@ -2781,6 +3201,7 @@
     <w:rPrDefault>
       <w:rPr>
         <w:rFonts w:ascii="Arial" w:cs="Arial" w:eastAsia="Arial" w:hAnsi="Arial"/>
+        <w:color w:val="2B2B2B"/>
         <w:sz w:val="22"/>
         <w:szCs w:val="22"/>
       </w:rPr>
@@ -2970,7 +3391,7 @@
       <w:rFonts w:ascii="Arial" w:cs="Arial" w:eastAsia="Arial" w:hAnsi="Arial"/>
       <w:b/>
       <w:bCs/>
-      <w:color w:val="1F4E79"/>
+      <w:color w:val="005E8F"/>
       <w:sz w:val="28"/>
       <w:szCs w:val="28"/>
     </w:rPr>
@@ -2987,9 +3408,9 @@
       <w:rFonts w:ascii="Arial" w:cs="Arial" w:eastAsia="Arial" w:hAnsi="Arial"/>
       <w:b/>
       <w:bCs/>
-      <w:color w:val="404040"/>
-      <w:sz w:val="24"/>
-      <w:szCs w:val="24"/>
+      <w:color w:val="005E8F"/>
+      <w:sz w:val="23"/>
+      <w:szCs w:val="23"/>
     </w:rPr>
   </w:style>
 </w:styles>

</xml_diff>